<commit_message>
Add a call to action addressed to BOP leadership
Asks Director Marshall and Deputy Director Smith for a single national
visiting standard. Both titles verified: Marshall sworn in April 2025,
Smith in June 2025. The appeal is aimed at Smith in particular, since
he is the first person to hold senior BOP leadership after serving
time in the agency's custody.

Co-Authored-By: Claude Opus 5 <noreply@anthropic.com>
Claude-Session: https://claude.ai/code/session_01Pk1A5UusdgnU9bEu3BZJo4
</commit_message>
<xml_diff>
--- a/content/substack/visiting-day-whoever-is-working-the-door.docx
+++ b/content/substack/visiting-day-whoever-is-working-the-door.docx
@@ -427,6 +427,46 @@
     </w:p>
     <w:p>
       <w:r>
+        <w:rPr>
+          <w:b/>
+        </w:rPr>
+        <w:t>Director Marshall. Deputy Director Smith.</w:t>
+      </w:r>
+    </w:p>
+    <w:p>
+      <w:r>
+        <w:t>Deputy Director Smith — you are the first person to hold senior leadership in this agency after serving time in its custody. You know what a visit is worth.</w:t>
+      </w:r>
+    </w:p>
+    <w:p>
+      <w:r>
+        <w:t>Publish one national visiting standard. One dress code, one page, identical at every institution, posted where a family can read it before they book a flight.</w:t>
+      </w:r>
+    </w:p>
+    <w:p>
+      <w:r>
+        <w:t>There is no national standard today. Every institution writes its own, and the Bureau makes the inmate responsible for explaining it to his own family. That is how a stepfather drives an hour and loses his son's birthday over a shade of white that appears in no rule.</w:t>
+      </w:r>
+    </w:p>
+    <w:p>
+      <w:r>
+        <w:t>These families committed no crime. They are taxpayers. They pay the salary of every employee in your agency, including the one standing at that door.</w:t>
+      </w:r>
+    </w:p>
+    <w:p>
+      <w:r>
+        <w:t>Give them one page.</w:t>
+      </w:r>
+    </w:p>
+    <w:p>
+      <w:pPr>
+        <w:pBdr>
+          <w:bottom w:val="single" w:sz="6" w:space="1" w:color="000000"/>
+        </w:pBdr>
+      </w:pPr>
+    </w:p>
+    <w:p>
+      <w:r>
         <w:t>My sister got in that day. She spent the first twenty minutes of our visit laughing about wearing our father's pants.</w:t>
       </w:r>
     </w:p>

</xml_diff>

<commit_message>
Quote the dress code example verbatim and emphasize "with"
The rule was paraphrased where it should have been quoted, since the
argument turns on its exact wording. Now reproduces the supplement's
own example and italicizes the conjunction that makes it a
combination rather than a ban on white shirts.

Co-Authored-By: Claude Opus 5 <noreply@anthropic.com>
Claude-Session: https://claude.ai/code/session_01Pk1A5UusdgnU9bEu3BZJo4
</commit_message>
<xml_diff>
--- a/content/substack/visiting-day-whoever-is-working-the-door.docx
+++ b/content/substack/visiting-day-whoever-is-working-the-door.docx
@@ -223,7 +223,16 @@
     </w:p>
     <w:p>
       <w:r>
-        <w:t>Now hold that against what Fort Dix actually publishes. The rule bans clothing that resembles what inmates are issued, and gives the example of khaki clothing with a plain white or khaki shirt.</w:t>
+        <w:t xml:space="preserve">Now hold that against what Fort Dix actually publishes. The rule bans clothing that resembles what inmates are issued, and gives one example: "khaki colored clothing </w:t>
+      </w:r>
+      <w:r>
+        <w:rPr>
+          <w:i/>
+        </w:rPr>
+        <w:t>with</w:t>
+      </w:r>
+      <w:r>
+        <w:t xml:space="preserve"> plain white or khaki shirt at the FCI."</w:t>
       </w:r>
     </w:p>
     <w:p>

</xml_diff>